<commit_message>
Auftragsbestätigung: Kundenadresse ergänzen (war übersehenes Textfeld)
Die Vorlage hat ein eigenes, seitenfest verankertes Adressfeld oben links
(floating Textbox, kein normaler Absatz) — beim ersten Abtasten der
Vorlage übersehen, da es leer und nicht als normaler <w:p> auffindbar war.
Jetzt per docxtpl-Absatzschleife gefüllt; dieselben Zeilen füllen auch die
Versandanschrift mehrzeilig (vorher einzeilig mit Komma, lief über den
Rand). Mit libreoffice-writer (vorher fehlte das Paket, daher "source file
could not be loaded" bei jeder PDF-Konvertierung) gegen eine echte
Auftragsbestätigung von Philipp verglichen — stimmt jetzt überein.

Co-Authored-By: Claude Sonnet 5 <noreply@anthropic.com>
Claude-Session: https://claude.ai/code/session_01KPzBqYronSEZwgbV7mSWkF
</commit_message>
<xml_diff>
--- a/vorlagen/auftragsbestaetigung/Auftragsbestaetigung.docx
+++ b/vorlagen/auftragsbestaetigung/Auftragsbestaetigung.docx
@@ -551,8 +551,6 @@
         <w:ind w:right="-1192"/>
         <w:rPr>
           <w:rFonts w:ascii="Arial" w:hAnsi="Arial" w:cs="Arial"/>
-          <w:b/>
-          <w:color w:val="000000" w:themeColor="text1"/>
           <w:sz w:val="20"/>
           <w:szCs w:val="20"/>
         </w:rPr>
@@ -560,29 +558,104 @@
       <w:r>
         <w:rPr>
           <w:rFonts w:ascii="Arial" w:hAnsi="Arial" w:cs="Arial"/>
-          <w:b/>
-          <w:color w:val="000000" w:themeColor="text1"/>
           <w:sz w:val="20"/>
           <w:szCs w:val="20"/>
+          <w:b/>
         </w:rPr>
         <w:t xml:space="preserve">{{ lieferbedingungen }}</w:t>
       </w:r>
       <w:r>
         <w:rPr>
           <w:rFonts w:ascii="Arial" w:hAnsi="Arial" w:cs="Arial"/>
-          <w:color w:val="000000" w:themeColor="text1"/>
-          <w:sz w:val="16"/>
+          <w:sz w:val="20"/>
+          <w:szCs w:val="20"/>
         </w:rPr>
         <w:tab/>
       </w:r>
       <w:r>
         <w:rPr>
           <w:rFonts w:ascii="Arial" w:hAnsi="Arial" w:cs="Arial"/>
-          <w:color w:val="000000" w:themeColor="text1"/>
           <w:sz w:val="20"/>
           <w:szCs w:val="20"/>
         </w:rPr>
-        <w:t>{{ versandanschrift }}</w:t>
+        <w:t>{{ versand_erste_zeile }}</w:t>
+      </w:r>
+    </w:p>
+    <w:p>
+      <w:pPr>
+        <w:framePr w:w="9894" w:hSpace="142" w:wrap="around" w:vAnchor="page" w:hAnchor="page" w:x="1135" w:y="5671" w:anchorLock="1"/>
+        <w:tabs>
+          <w:tab w:val="left" w:pos="5670"/>
+        </w:tabs>
+        <w:spacing w:after="0" w:line="240" w:lineRule="auto"/>
+        <w:ind w:right="-1192"/>
+        <w:rPr>
+          <w:rFonts w:ascii="Arial" w:hAnsi="Arial" w:cs="Arial"/>
+          <w:sz w:val="20"/>
+          <w:szCs w:val="20"/>
+        </w:rPr>
+      </w:pPr>
+      <w:r>
+        <w:rPr>
+          <w:rFonts w:ascii="Arial" w:hAnsi="Arial" w:cs="Arial"/>
+          <w:sz w:val="20"/>
+          <w:szCs w:val="20"/>
+        </w:rPr>
+        <w:t>{%p for line in versand_weitere_zeilen %}</w:t>
+      </w:r>
+    </w:p>
+    <w:p>
+      <w:pPr>
+        <w:framePr w:w="9894" w:hSpace="142" w:wrap="around" w:vAnchor="page" w:hAnchor="page" w:x="1135" w:y="5671" w:anchorLock="1"/>
+        <w:tabs>
+          <w:tab w:val="left" w:pos="5670"/>
+        </w:tabs>
+        <w:spacing w:after="0" w:line="240" w:lineRule="auto"/>
+        <w:ind w:right="-1192"/>
+        <w:rPr>
+          <w:rFonts w:ascii="Arial" w:hAnsi="Arial" w:cs="Arial"/>
+          <w:sz w:val="20"/>
+          <w:szCs w:val="20"/>
+        </w:rPr>
+      </w:pPr>
+      <w:r>
+        <w:rPr>
+          <w:rFonts w:ascii="Arial" w:hAnsi="Arial" w:cs="Arial"/>
+          <w:sz w:val="20"/>
+          <w:szCs w:val="20"/>
+        </w:rPr>
+        <w:tab/>
+      </w:r>
+      <w:r>
+        <w:rPr>
+          <w:rFonts w:ascii="Arial" w:hAnsi="Arial" w:cs="Arial"/>
+          <w:sz w:val="20"/>
+          <w:szCs w:val="20"/>
+        </w:rPr>
+        <w:t>{{ line }}</w:t>
+      </w:r>
+    </w:p>
+    <w:p>
+      <w:pPr>
+        <w:framePr w:w="9894" w:hSpace="142" w:wrap="around" w:vAnchor="page" w:hAnchor="page" w:x="1135" w:y="5671" w:anchorLock="1"/>
+        <w:tabs>
+          <w:tab w:val="left" w:pos="5670"/>
+        </w:tabs>
+        <w:spacing w:after="0" w:line="240" w:lineRule="auto"/>
+        <w:ind w:right="-1192"/>
+        <w:rPr>
+          <w:rFonts w:ascii="Arial" w:hAnsi="Arial" w:cs="Arial"/>
+          <w:sz w:val="20"/>
+          <w:szCs w:val="20"/>
+        </w:rPr>
+      </w:pPr>
+      <w:r>
+        <w:rPr>
+          <w:rFonts w:ascii="Arial" w:hAnsi="Arial" w:cs="Arial"/>
+          <w:sz w:val="20"/>
+          <w:szCs w:val="20"/>
+        </w:rPr>
+        <w:t>{%p endfor %}</w:t>
       </w:r>
     </w:p>
     <w:p>
@@ -1124,6 +1197,50 @@
                                 <w:szCs w:val="20"/>
                               </w:rPr>
                             </w:pPr>
+                            <w:r>
+                              <w:rPr>
+                                <w:rFonts w:ascii="Arial" w:hAnsi="Arial" w:cs="Arial"/>
+                                <w:sz w:val="20"/>
+                                <w:szCs w:val="20"/>
+                              </w:rPr>
+                              <w:t>{%p for line in adresse_zeilen %}</w:t>
+                            </w:r>
+                          </w:p>
+                          <w:p>
+                            <w:pPr>
+                              <w:spacing w:after="0" w:line="240" w:lineRule="auto"/>
+                              <w:rPr>
+                                <w:rFonts w:ascii="Arial" w:hAnsi="Arial" w:cs="Arial"/>
+                                <w:sz w:val="20"/>
+                                <w:szCs w:val="20"/>
+                              </w:rPr>
+                            </w:pPr>
+                            <w:r>
+                              <w:rPr>
+                                <w:rFonts w:ascii="Arial" w:hAnsi="Arial" w:cs="Arial"/>
+                                <w:sz w:val="20"/>
+                                <w:szCs w:val="20"/>
+                              </w:rPr>
+                              <w:t>{{ line }}</w:t>
+                            </w:r>
+                          </w:p>
+                          <w:p>
+                            <w:pPr>
+                              <w:spacing w:after="0" w:line="240" w:lineRule="auto"/>
+                              <w:rPr>
+                                <w:rFonts w:ascii="Arial" w:hAnsi="Arial" w:cs="Arial"/>
+                                <w:sz w:val="20"/>
+                                <w:szCs w:val="20"/>
+                              </w:rPr>
+                            </w:pPr>
+                            <w:r>
+                              <w:rPr>
+                                <w:rFonts w:ascii="Arial" w:hAnsi="Arial" w:cs="Arial"/>
+                                <w:sz w:val="20"/>
+                                <w:szCs w:val="20"/>
+                              </w:rPr>
+                              <w:t>{%p endfor %}</w:t>
+                            </w:r>
                           </w:p>
                         </w:txbxContent>
                       </wps:txbx>
@@ -1156,6 +1273,50 @@
                           <w:szCs w:val="20"/>
                         </w:rPr>
                       </w:pPr>
+                      <w:r>
+                        <w:rPr>
+                          <w:rFonts w:ascii="Arial" w:hAnsi="Arial" w:cs="Arial"/>
+                          <w:sz w:val="20"/>
+                          <w:szCs w:val="20"/>
+                        </w:rPr>
+                        <w:t>{%p for line in adresse_zeilen %}</w:t>
+                      </w:r>
+                    </w:p>
+                    <w:p>
+                      <w:pPr>
+                        <w:spacing w:after="0" w:line="240" w:lineRule="auto"/>
+                        <w:rPr>
+                          <w:rFonts w:ascii="Arial" w:hAnsi="Arial" w:cs="Arial"/>
+                          <w:sz w:val="20"/>
+                          <w:szCs w:val="20"/>
+                        </w:rPr>
+                      </w:pPr>
+                      <w:r>
+                        <w:rPr>
+                          <w:rFonts w:ascii="Arial" w:hAnsi="Arial" w:cs="Arial"/>
+                          <w:sz w:val="20"/>
+                          <w:szCs w:val="20"/>
+                        </w:rPr>
+                        <w:t>{{ line }}</w:t>
+                      </w:r>
+                    </w:p>
+                    <w:p>
+                      <w:pPr>
+                        <w:spacing w:after="0" w:line="240" w:lineRule="auto"/>
+                        <w:rPr>
+                          <w:rFonts w:ascii="Arial" w:hAnsi="Arial" w:cs="Arial"/>
+                          <w:sz w:val="20"/>
+                          <w:szCs w:val="20"/>
+                        </w:rPr>
+                      </w:pPr>
+                      <w:r>
+                        <w:rPr>
+                          <w:rFonts w:ascii="Arial" w:hAnsi="Arial" w:cs="Arial"/>
+                          <w:sz w:val="20"/>
+                          <w:szCs w:val="20"/>
+                        </w:rPr>
+                        <w:t>{%p endfor %}</w:t>
+                      </w:r>
                     </w:p>
                   </w:txbxContent>
                 </v:textbox>

</xml_diff>

<commit_message>
Auftragsbestätigung: 19% MwSt optional ein-/ausschaltbar
Neuer Haken "19% MwSt anwenden" (Standard: an). Ohne Haken erscheint die
"+ 19% MwSt"-Zeile im Word-Dokument gar nicht (docxtpl {%tr if %}/{%tr
endif %} um die Tabellenzeile), nicht nur mit 0,00 € — Summe/Gesamtsumme
bleiben stehen und sind dann identisch.

Co-Authored-By: Claude Sonnet 5 <noreply@anthropic.com>
Claude-Session: https://claude.ai/code/session_01KPzBqYronSEZwgbV7mSWkF
</commit_message>
<xml_diff>
--- a/vorlagen/auftragsbestaetigung/Auftragsbestaetigung.docx
+++ b/vorlagen/auftragsbestaetigung/Auftragsbestaetigung.docx
@@ -2012,6 +2012,18 @@
         </w:tc>
       </w:tr>
       <w:tr>
+        <w:tc>
+          <w:tcPr>
+            <w:tcW w:w="0" w:type="auto"/>
+          </w:tcPr>
+          <w:p>
+            <w:r>
+              <w:t>{%tr if mwst_anwenden %}</w:t>
+            </w:r>
+          </w:p>
+        </w:tc>
+      </w:tr>
+      <w:tr>
         <w:trPr>
           <w:cantSplit/>
           <w:trHeight w:val="20"/>
@@ -2131,6 +2143,18 @@
                 <w:szCs w:val="20"/>
               </w:rPr>
               <w:t xml:space="preserve">{{ mwst }}</w:t>
+            </w:r>
+          </w:p>
+        </w:tc>
+      </w:tr>
+      <w:tr>
+        <w:tc>
+          <w:tcPr>
+            <w:tcW w:w="0" w:type="auto"/>
+          </w:tcPr>
+          <w:p>
+            <w:r>
+              <w:t>{%tr endif %}</w:t>
             </w:r>
           </w:p>
         </w:tc>

</xml_diff>